<commit_message>
Cambio de contenido en bibliografia
</commit_message>
<xml_diff>
--- a/Bibliografia.docx
+++ b/Bibliografia.docx
@@ -2,14 +2,1188 @@
 <file path=word/document.xml><?xml version="1.0" encoding="utf-8"?>
 <w:document xmlns:wpc="http://schemas.microsoft.com/office/word/2010/wordprocessingCanvas" xmlns:cx="http://schemas.microsoft.com/office/drawing/2014/chartex" xmlns:cx1="http://schemas.microsoft.com/office/drawing/2015/9/8/chartex" xmlns:cx2="http://schemas.microsoft.com/office/drawing/2015/10/21/chartex" xmlns:cx3="http://schemas.microsoft.com/office/drawing/2016/5/9/chartex" xmlns:cx4="http://schemas.microsoft.com/office/drawing/2016/5/10/chartex" xmlns:cx5="http://schemas.microsoft.com/office/drawing/2016/5/11/chartex" xmlns:cx6="http://schemas.microsoft.com/office/drawing/2016/5/12/chartex" xmlns:cx7="http://schemas.microsoft.com/office/drawing/2016/5/13/chartex" xmlns:cx8="http://schemas.microsoft.com/office/drawing/2016/5/14/chartex" xmlns:mc="http://schemas.openxmlformats.org/markup-compatibility/2006" xmlns:aink="http://schemas.microsoft.com/office/drawing/2016/ink" xmlns:am3d="http://schemas.microsoft.com/office/drawing/2017/model3d" xmlns:o="urn:schemas-microsoft-com:office:office" xmlns:oel="http://schemas.microsoft.com/office/2019/extlst" xmlns:r="http://schemas.openxmlformats.org/officeDocument/2006/relationships" xmlns:m="http://schemas.openxmlformats.org/officeDocument/2006/math" xmlns:v="urn:schemas-microsoft-com:vml" xmlns:wp14="http://schemas.microsoft.com/office/word/2010/wordprocessingDrawing" xmlns:wp="http://schemas.openxmlformats.org/drawingml/2006/wordprocessingDrawing" xmlns:w10="urn:schemas-microsoft-com:office:word" xmlns:w="http://schemas.openxmlformats.org/wordprocessingml/2006/main" xmlns:w14="http://schemas.microsoft.com/office/word/2010/wordml" xmlns:w15="http://schemas.microsoft.com/office/word/2012/wordml" xmlns:w16cex="http://schemas.microsoft.com/office/word/2018/wordml/cex" xmlns:w16cid="http://schemas.microsoft.com/office/word/2016/wordml/cid" xmlns:w16="http://schemas.microsoft.com/office/word/2018/wordml" xmlns:w16sdtdh="http://schemas.microsoft.com/office/word/2020/wordml/sdtdatahash" xmlns:w16se="http://schemas.microsoft.com/office/word/2015/wordml/symex" xmlns:wpg="http://schemas.microsoft.com/office/word/2010/wordprocessingGroup" xmlns:wpi="http://schemas.microsoft.com/office/word/2010/wordprocessingInk" xmlns:wne="http://schemas.microsoft.com/office/word/2006/wordml" xmlns:wps="http://schemas.microsoft.com/office/word/2010/wordprocessingShape" mc:Ignorable="w14 w15 w16se w16cid w16 w16cex w16sdtdh wp14">
   <w:body>
-    <w:p>
-      <w:r>
-        <w:t>CREACION DE FORMULARIO DE INICIO DE SESIÓN:</w:t>
-      </w:r>
-      <w:r>
-        <w:t xml:space="preserve"> </w:t>
-      </w:r>
-      <w:hyperlink r:id="rId4" w:history="1">
+    <w:sdt>
+      <w:sdtPr>
+        <w:rPr>
+          <w:lang w:val="es-ES"/>
+        </w:rPr>
+        <w:id w:val="-2107264035"/>
+        <w:docPartObj>
+          <w:docPartGallery w:val="Table of Contents"/>
+          <w:docPartUnique/>
+        </w:docPartObj>
+      </w:sdtPr>
+      <w:sdtEndPr>
+        <w:rPr>
+          <w:rFonts w:ascii="Arial" w:eastAsiaTheme="minorHAnsi" w:hAnsi="Arial" w:cs="Arial"/>
+          <w:b/>
+          <w:bCs/>
+          <w:color w:val="000000" w:themeColor="text1"/>
+          <w:sz w:val="22"/>
+          <w:szCs w:val="24"/>
+          <w:lang w:eastAsia="en-US"/>
+        </w:rPr>
+      </w:sdtEndPr>
+      <w:sdtContent>
+        <w:p>
+          <w:pPr>
+            <w:pStyle w:val="TtuloTDC"/>
+          </w:pPr>
+          <w:r>
+            <w:rPr>
+              <w:lang w:val="es-ES"/>
+            </w:rPr>
+            <w:t>Contenido</w:t>
+          </w:r>
+        </w:p>
+        <w:p>
+          <w:pPr>
+            <w:pStyle w:val="TDC1"/>
+            <w:tabs>
+              <w:tab w:val="right" w:leader="dot" w:pos="9394"/>
+            </w:tabs>
+            <w:rPr>
+              <w:noProof/>
+            </w:rPr>
+          </w:pPr>
+          <w:r>
+            <w:fldChar w:fldCharType="begin"/>
+          </w:r>
+          <w:r>
+            <w:instrText xml:space="preserve"> TOC \o "1-3" \h \z \u </w:instrText>
+          </w:r>
+          <w:r>
+            <w:fldChar w:fldCharType="separate"/>
+          </w:r>
+          <w:hyperlink w:anchor="_Toc223970579" w:history="1">
+            <w:r>
+              <w:rPr>
+                <w:rStyle w:val="Hipervnculo"/>
+                <w:noProof/>
+              </w:rPr>
+              <w:t>CREACION DE FORMULARIO DE INICIO DE SESIÓN</w:t>
+            </w:r>
+            <w:r>
+              <w:rPr>
+                <w:noProof/>
+                <w:webHidden/>
+              </w:rPr>
+              <w:tab/>
+            </w:r>
+            <w:r>
+              <w:rPr>
+                <w:noProof/>
+                <w:webHidden/>
+              </w:rPr>
+              <w:fldChar w:fldCharType="begin"/>
+            </w:r>
+            <w:r>
+              <w:rPr>
+                <w:noProof/>
+                <w:webHidden/>
+              </w:rPr>
+              <w:instrText xml:space="preserve"> PAGEREF _Toc223970579 \h </w:instrText>
+            </w:r>
+            <w:r>
+              <w:rPr>
+                <w:noProof/>
+                <w:webHidden/>
+              </w:rPr>
+            </w:r>
+            <w:r>
+              <w:rPr>
+                <w:noProof/>
+                <w:webHidden/>
+              </w:rPr>
+              <w:fldChar w:fldCharType="separate"/>
+            </w:r>
+            <w:r>
+              <w:rPr>
+                <w:noProof/>
+                <w:webHidden/>
+              </w:rPr>
+              <w:t>2</w:t>
+            </w:r>
+            <w:r>
+              <w:rPr>
+                <w:noProof/>
+                <w:webHidden/>
+              </w:rPr>
+              <w:fldChar w:fldCharType="end"/>
+            </w:r>
+          </w:hyperlink>
+        </w:p>
+        <w:p>
+          <w:pPr>
+            <w:pStyle w:val="TDC1"/>
+            <w:tabs>
+              <w:tab w:val="right" w:leader="dot" w:pos="9394"/>
+            </w:tabs>
+            <w:rPr>
+              <w:noProof/>
+            </w:rPr>
+          </w:pPr>
+          <w:hyperlink w:anchor="_Toc223970580" w:history="1">
+            <w:r>
+              <w:rPr>
+                <w:rStyle w:val="Hipervnculo"/>
+                <w:noProof/>
+              </w:rPr>
+              <w:t>FORMULARIO STEP</w:t>
+            </w:r>
+            <w:r>
+              <w:rPr>
+                <w:noProof/>
+                <w:webHidden/>
+              </w:rPr>
+              <w:tab/>
+            </w:r>
+            <w:r>
+              <w:rPr>
+                <w:noProof/>
+                <w:webHidden/>
+              </w:rPr>
+              <w:fldChar w:fldCharType="begin"/>
+            </w:r>
+            <w:r>
+              <w:rPr>
+                <w:noProof/>
+                <w:webHidden/>
+              </w:rPr>
+              <w:instrText xml:space="preserve"> PAGEREF _Toc223970580 \h </w:instrText>
+            </w:r>
+            <w:r>
+              <w:rPr>
+                <w:noProof/>
+                <w:webHidden/>
+              </w:rPr>
+            </w:r>
+            <w:r>
+              <w:rPr>
+                <w:noProof/>
+                <w:webHidden/>
+              </w:rPr>
+              <w:fldChar w:fldCharType="separate"/>
+            </w:r>
+            <w:r>
+              <w:rPr>
+                <w:noProof/>
+                <w:webHidden/>
+              </w:rPr>
+              <w:t>2</w:t>
+            </w:r>
+            <w:r>
+              <w:rPr>
+                <w:noProof/>
+                <w:webHidden/>
+              </w:rPr>
+              <w:fldChar w:fldCharType="end"/>
+            </w:r>
+          </w:hyperlink>
+        </w:p>
+        <w:p>
+          <w:pPr>
+            <w:pStyle w:val="TDC1"/>
+            <w:tabs>
+              <w:tab w:val="right" w:leader="dot" w:pos="9394"/>
+            </w:tabs>
+            <w:rPr>
+              <w:noProof/>
+            </w:rPr>
+          </w:pPr>
+          <w:hyperlink w:anchor="_Toc223970581" w:history="1">
+            <w:r>
+              <w:rPr>
+                <w:rStyle w:val="Hipervnculo"/>
+                <w:noProof/>
+              </w:rPr>
+              <w:t>CREACION DE FORMULARIO DE REGISTRO</w:t>
+            </w:r>
+            <w:r>
+              <w:rPr>
+                <w:noProof/>
+                <w:webHidden/>
+              </w:rPr>
+              <w:tab/>
+            </w:r>
+            <w:r>
+              <w:rPr>
+                <w:noProof/>
+                <w:webHidden/>
+              </w:rPr>
+              <w:fldChar w:fldCharType="begin"/>
+            </w:r>
+            <w:r>
+              <w:rPr>
+                <w:noProof/>
+                <w:webHidden/>
+              </w:rPr>
+              <w:instrText xml:space="preserve"> PAGEREF _Toc223970581 \h </w:instrText>
+            </w:r>
+            <w:r>
+              <w:rPr>
+                <w:noProof/>
+                <w:webHidden/>
+              </w:rPr>
+            </w:r>
+            <w:r>
+              <w:rPr>
+                <w:noProof/>
+                <w:webHidden/>
+              </w:rPr>
+              <w:fldChar w:fldCharType="separate"/>
+            </w:r>
+            <w:r>
+              <w:rPr>
+                <w:noProof/>
+                <w:webHidden/>
+              </w:rPr>
+              <w:t>2</w:t>
+            </w:r>
+            <w:r>
+              <w:rPr>
+                <w:noProof/>
+                <w:webHidden/>
+              </w:rPr>
+              <w:fldChar w:fldCharType="end"/>
+            </w:r>
+          </w:hyperlink>
+        </w:p>
+        <w:p>
+          <w:pPr>
+            <w:pStyle w:val="TDC1"/>
+            <w:tabs>
+              <w:tab w:val="right" w:leader="dot" w:pos="9394"/>
+            </w:tabs>
+            <w:rPr>
+              <w:noProof/>
+            </w:rPr>
+          </w:pPr>
+          <w:hyperlink w:anchor="_Toc223970582" w:history="1">
+            <w:r>
+              <w:rPr>
+                <w:rStyle w:val="Hipervnculo"/>
+                <w:noProof/>
+              </w:rPr>
+              <w:t>RAZAS DE PERRO EXISTENTES</w:t>
+            </w:r>
+            <w:r>
+              <w:rPr>
+                <w:noProof/>
+                <w:webHidden/>
+              </w:rPr>
+              <w:tab/>
+            </w:r>
+            <w:r>
+              <w:rPr>
+                <w:noProof/>
+                <w:webHidden/>
+              </w:rPr>
+              <w:fldChar w:fldCharType="begin"/>
+            </w:r>
+            <w:r>
+              <w:rPr>
+                <w:noProof/>
+                <w:webHidden/>
+              </w:rPr>
+              <w:instrText xml:space="preserve"> PAGEREF _Toc223970582 \h </w:instrText>
+            </w:r>
+            <w:r>
+              <w:rPr>
+                <w:noProof/>
+                <w:webHidden/>
+              </w:rPr>
+            </w:r>
+            <w:r>
+              <w:rPr>
+                <w:noProof/>
+                <w:webHidden/>
+              </w:rPr>
+              <w:fldChar w:fldCharType="separate"/>
+            </w:r>
+            <w:r>
+              <w:rPr>
+                <w:noProof/>
+                <w:webHidden/>
+              </w:rPr>
+              <w:t>2</w:t>
+            </w:r>
+            <w:r>
+              <w:rPr>
+                <w:noProof/>
+                <w:webHidden/>
+              </w:rPr>
+              <w:fldChar w:fldCharType="end"/>
+            </w:r>
+          </w:hyperlink>
+        </w:p>
+        <w:p>
+          <w:pPr>
+            <w:pStyle w:val="TDC1"/>
+            <w:tabs>
+              <w:tab w:val="right" w:leader="dot" w:pos="9394"/>
+            </w:tabs>
+            <w:rPr>
+              <w:noProof/>
+            </w:rPr>
+          </w:pPr>
+          <w:hyperlink w:anchor="_Toc223970583" w:history="1">
+            <w:r>
+              <w:rPr>
+                <w:rStyle w:val="Hipervnculo"/>
+                <w:noProof/>
+              </w:rPr>
+              <w:t>RAZAS DE GATOS EXISTENTES</w:t>
+            </w:r>
+            <w:r>
+              <w:rPr>
+                <w:noProof/>
+                <w:webHidden/>
+              </w:rPr>
+              <w:tab/>
+            </w:r>
+            <w:r>
+              <w:rPr>
+                <w:noProof/>
+                <w:webHidden/>
+              </w:rPr>
+              <w:fldChar w:fldCharType="begin"/>
+            </w:r>
+            <w:r>
+              <w:rPr>
+                <w:noProof/>
+                <w:webHidden/>
+              </w:rPr>
+              <w:instrText xml:space="preserve"> PAGEREF _Toc223970583 \h </w:instrText>
+            </w:r>
+            <w:r>
+              <w:rPr>
+                <w:noProof/>
+                <w:webHidden/>
+              </w:rPr>
+            </w:r>
+            <w:r>
+              <w:rPr>
+                <w:noProof/>
+                <w:webHidden/>
+              </w:rPr>
+              <w:fldChar w:fldCharType="separate"/>
+            </w:r>
+            <w:r>
+              <w:rPr>
+                <w:noProof/>
+                <w:webHidden/>
+              </w:rPr>
+              <w:t>2</w:t>
+            </w:r>
+            <w:r>
+              <w:rPr>
+                <w:noProof/>
+                <w:webHidden/>
+              </w:rPr>
+              <w:fldChar w:fldCharType="end"/>
+            </w:r>
+          </w:hyperlink>
+        </w:p>
+        <w:p>
+          <w:pPr>
+            <w:pStyle w:val="TDC1"/>
+            <w:tabs>
+              <w:tab w:val="right" w:leader="dot" w:pos="9394"/>
+            </w:tabs>
+            <w:rPr>
+              <w:noProof/>
+            </w:rPr>
+          </w:pPr>
+          <w:hyperlink w:anchor="_Toc223970584" w:history="1">
+            <w:r>
+              <w:rPr>
+                <w:rStyle w:val="Hipervnculo"/>
+                <w:noProof/>
+              </w:rPr>
+              <w:t>RAZAS DE REPTILES Y ARTOPODOS</w:t>
+            </w:r>
+            <w:r>
+              <w:rPr>
+                <w:noProof/>
+                <w:webHidden/>
+              </w:rPr>
+              <w:tab/>
+            </w:r>
+            <w:r>
+              <w:rPr>
+                <w:noProof/>
+                <w:webHidden/>
+              </w:rPr>
+              <w:fldChar w:fldCharType="begin"/>
+            </w:r>
+            <w:r>
+              <w:rPr>
+                <w:noProof/>
+                <w:webHidden/>
+              </w:rPr>
+              <w:instrText xml:space="preserve"> PAGEREF _Toc223970584 \h </w:instrText>
+            </w:r>
+            <w:r>
+              <w:rPr>
+                <w:noProof/>
+                <w:webHidden/>
+              </w:rPr>
+            </w:r>
+            <w:r>
+              <w:rPr>
+                <w:noProof/>
+                <w:webHidden/>
+              </w:rPr>
+              <w:fldChar w:fldCharType="separate"/>
+            </w:r>
+            <w:r>
+              <w:rPr>
+                <w:noProof/>
+                <w:webHidden/>
+              </w:rPr>
+              <w:t>2</w:t>
+            </w:r>
+            <w:r>
+              <w:rPr>
+                <w:noProof/>
+                <w:webHidden/>
+              </w:rPr>
+              <w:fldChar w:fldCharType="end"/>
+            </w:r>
+          </w:hyperlink>
+        </w:p>
+        <w:p>
+          <w:pPr>
+            <w:pStyle w:val="TDC1"/>
+            <w:tabs>
+              <w:tab w:val="right" w:leader="dot" w:pos="9394"/>
+            </w:tabs>
+            <w:rPr>
+              <w:noProof/>
+            </w:rPr>
+          </w:pPr>
+          <w:hyperlink w:anchor="_Toc223970585" w:history="1">
+            <w:r>
+              <w:rPr>
+                <w:rStyle w:val="Hipervnculo"/>
+                <w:noProof/>
+              </w:rPr>
+              <w:t>CREACION DE MENU PRINCIPAL</w:t>
+            </w:r>
+            <w:r>
+              <w:rPr>
+                <w:noProof/>
+                <w:webHidden/>
+              </w:rPr>
+              <w:tab/>
+            </w:r>
+            <w:r>
+              <w:rPr>
+                <w:noProof/>
+                <w:webHidden/>
+              </w:rPr>
+              <w:fldChar w:fldCharType="begin"/>
+            </w:r>
+            <w:r>
+              <w:rPr>
+                <w:noProof/>
+                <w:webHidden/>
+              </w:rPr>
+              <w:instrText xml:space="preserve"> PAGEREF _Toc223970585 \h </w:instrText>
+            </w:r>
+            <w:r>
+              <w:rPr>
+                <w:noProof/>
+                <w:webHidden/>
+              </w:rPr>
+            </w:r>
+            <w:r>
+              <w:rPr>
+                <w:noProof/>
+                <w:webHidden/>
+              </w:rPr>
+              <w:fldChar w:fldCharType="separate"/>
+            </w:r>
+            <w:r>
+              <w:rPr>
+                <w:noProof/>
+                <w:webHidden/>
+              </w:rPr>
+              <w:t>2</w:t>
+            </w:r>
+            <w:r>
+              <w:rPr>
+                <w:noProof/>
+                <w:webHidden/>
+              </w:rPr>
+              <w:fldChar w:fldCharType="end"/>
+            </w:r>
+          </w:hyperlink>
+        </w:p>
+        <w:p>
+          <w:pPr>
+            <w:pStyle w:val="TDC1"/>
+            <w:tabs>
+              <w:tab w:val="right" w:leader="dot" w:pos="9394"/>
+            </w:tabs>
+            <w:rPr>
+              <w:noProof/>
+            </w:rPr>
+          </w:pPr>
+          <w:hyperlink w:anchor="_Toc223970586" w:history="1">
+            <w:r>
+              <w:rPr>
+                <w:rStyle w:val="Hipervnculo"/>
+                <w:noProof/>
+              </w:rPr>
+              <w:t>SEPARAR POR LINEAS LOS PARRAFOS</w:t>
+            </w:r>
+            <w:r>
+              <w:rPr>
+                <w:noProof/>
+                <w:webHidden/>
+              </w:rPr>
+              <w:tab/>
+            </w:r>
+            <w:r>
+              <w:rPr>
+                <w:noProof/>
+                <w:webHidden/>
+              </w:rPr>
+              <w:fldChar w:fldCharType="begin"/>
+            </w:r>
+            <w:r>
+              <w:rPr>
+                <w:noProof/>
+                <w:webHidden/>
+              </w:rPr>
+              <w:instrText xml:space="preserve"> PAGEREF _Toc223970586 \h </w:instrText>
+            </w:r>
+            <w:r>
+              <w:rPr>
+                <w:noProof/>
+                <w:webHidden/>
+              </w:rPr>
+            </w:r>
+            <w:r>
+              <w:rPr>
+                <w:noProof/>
+                <w:webHidden/>
+              </w:rPr>
+              <w:fldChar w:fldCharType="separate"/>
+            </w:r>
+            <w:r>
+              <w:rPr>
+                <w:noProof/>
+                <w:webHidden/>
+              </w:rPr>
+              <w:t>3</w:t>
+            </w:r>
+            <w:r>
+              <w:rPr>
+                <w:noProof/>
+                <w:webHidden/>
+              </w:rPr>
+              <w:fldChar w:fldCharType="end"/>
+            </w:r>
+          </w:hyperlink>
+        </w:p>
+        <w:p>
+          <w:pPr>
+            <w:pStyle w:val="TDC1"/>
+            <w:tabs>
+              <w:tab w:val="right" w:leader="dot" w:pos="9394"/>
+            </w:tabs>
+            <w:rPr>
+              <w:noProof/>
+            </w:rPr>
+          </w:pPr>
+          <w:hyperlink w:anchor="_Toc223970587" w:history="1">
+            <w:r>
+              <w:rPr>
+                <w:rStyle w:val="Hipervnculo"/>
+                <w:noProof/>
+              </w:rPr>
+              <w:t>INSERCION DE FUENTES EXTERNAS:</w:t>
+            </w:r>
+            <w:r>
+              <w:rPr>
+                <w:noProof/>
+                <w:webHidden/>
+              </w:rPr>
+              <w:tab/>
+            </w:r>
+            <w:r>
+              <w:rPr>
+                <w:noProof/>
+                <w:webHidden/>
+              </w:rPr>
+              <w:fldChar w:fldCharType="begin"/>
+            </w:r>
+            <w:r>
+              <w:rPr>
+                <w:noProof/>
+                <w:webHidden/>
+              </w:rPr>
+              <w:instrText xml:space="preserve"> PAGEREF _Toc223970587 \h </w:instrText>
+            </w:r>
+            <w:r>
+              <w:rPr>
+                <w:noProof/>
+                <w:webHidden/>
+              </w:rPr>
+            </w:r>
+            <w:r>
+              <w:rPr>
+                <w:noProof/>
+                <w:webHidden/>
+              </w:rPr>
+              <w:fldChar w:fldCharType="separate"/>
+            </w:r>
+            <w:r>
+              <w:rPr>
+                <w:noProof/>
+                <w:webHidden/>
+              </w:rPr>
+              <w:t>3</w:t>
+            </w:r>
+            <w:r>
+              <w:rPr>
+                <w:noProof/>
+                <w:webHidden/>
+              </w:rPr>
+              <w:fldChar w:fldCharType="end"/>
+            </w:r>
+          </w:hyperlink>
+        </w:p>
+        <w:p>
+          <w:pPr>
+            <w:pStyle w:val="TDC1"/>
+            <w:tabs>
+              <w:tab w:val="right" w:leader="dot" w:pos="9394"/>
+            </w:tabs>
+            <w:rPr>
+              <w:noProof/>
+            </w:rPr>
+          </w:pPr>
+          <w:hyperlink w:anchor="_Toc223970588" w:history="1">
+            <w:r>
+              <w:rPr>
+                <w:rStyle w:val="Hipervnculo"/>
+                <w:noProof/>
+              </w:rPr>
+              <w:t>HACER QUE GOOGLE CONOZCA LA PAGINA</w:t>
+            </w:r>
+            <w:r>
+              <w:rPr>
+                <w:noProof/>
+                <w:webHidden/>
+              </w:rPr>
+              <w:tab/>
+            </w:r>
+            <w:r>
+              <w:rPr>
+                <w:noProof/>
+                <w:webHidden/>
+              </w:rPr>
+              <w:fldChar w:fldCharType="begin"/>
+            </w:r>
+            <w:r>
+              <w:rPr>
+                <w:noProof/>
+                <w:webHidden/>
+              </w:rPr>
+              <w:instrText xml:space="preserve"> PAGEREF _Toc223970588 \h </w:instrText>
+            </w:r>
+            <w:r>
+              <w:rPr>
+                <w:noProof/>
+                <w:webHidden/>
+              </w:rPr>
+            </w:r>
+            <w:r>
+              <w:rPr>
+                <w:noProof/>
+                <w:webHidden/>
+              </w:rPr>
+              <w:fldChar w:fldCharType="separate"/>
+            </w:r>
+            <w:r>
+              <w:rPr>
+                <w:noProof/>
+                <w:webHidden/>
+              </w:rPr>
+              <w:t>3</w:t>
+            </w:r>
+            <w:r>
+              <w:rPr>
+                <w:noProof/>
+                <w:webHidden/>
+              </w:rPr>
+              <w:fldChar w:fldCharType="end"/>
+            </w:r>
+          </w:hyperlink>
+        </w:p>
+        <w:p>
+          <w:pPr>
+            <w:pStyle w:val="TDC1"/>
+            <w:tabs>
+              <w:tab w:val="right" w:leader="dot" w:pos="9394"/>
+            </w:tabs>
+            <w:rPr>
+              <w:noProof/>
+            </w:rPr>
+          </w:pPr>
+          <w:hyperlink w:anchor="_Toc223970589" w:history="1">
+            <w:r>
+              <w:rPr>
+                <w:rStyle w:val="Hipervnculo"/>
+                <w:noProof/>
+              </w:rPr>
+              <w:t>AGREGAR DESLIZAMIENTO CON BOTON</w:t>
+            </w:r>
+            <w:r>
+              <w:rPr>
+                <w:noProof/>
+                <w:webHidden/>
+              </w:rPr>
+              <w:tab/>
+            </w:r>
+            <w:r>
+              <w:rPr>
+                <w:noProof/>
+                <w:webHidden/>
+              </w:rPr>
+              <w:fldChar w:fldCharType="begin"/>
+            </w:r>
+            <w:r>
+              <w:rPr>
+                <w:noProof/>
+                <w:webHidden/>
+              </w:rPr>
+              <w:instrText xml:space="preserve"> PAGEREF _Toc223970589 \h </w:instrText>
+            </w:r>
+            <w:r>
+              <w:rPr>
+                <w:noProof/>
+                <w:webHidden/>
+              </w:rPr>
+            </w:r>
+            <w:r>
+              <w:rPr>
+                <w:noProof/>
+                <w:webHidden/>
+              </w:rPr>
+              <w:fldChar w:fldCharType="separate"/>
+            </w:r>
+            <w:r>
+              <w:rPr>
+                <w:noProof/>
+                <w:webHidden/>
+              </w:rPr>
+              <w:t>3</w:t>
+            </w:r>
+            <w:r>
+              <w:rPr>
+                <w:noProof/>
+                <w:webHidden/>
+              </w:rPr>
+              <w:fldChar w:fldCharType="end"/>
+            </w:r>
+          </w:hyperlink>
+        </w:p>
+        <w:p>
+          <w:pPr>
+            <w:pStyle w:val="TDC1"/>
+            <w:tabs>
+              <w:tab w:val="right" w:leader="dot" w:pos="9394"/>
+            </w:tabs>
+            <w:rPr>
+              <w:noProof/>
+            </w:rPr>
+          </w:pPr>
+          <w:hyperlink w:anchor="_Toc223970590" w:history="1">
+            <w:r>
+              <w:rPr>
+                <w:rStyle w:val="Hipervnculo"/>
+                <w:noProof/>
+              </w:rPr>
+              <w:t>OCULTAR O MOSTRAR UNA CONTRASENA</w:t>
+            </w:r>
+            <w:r>
+              <w:rPr>
+                <w:noProof/>
+                <w:webHidden/>
+              </w:rPr>
+              <w:tab/>
+            </w:r>
+            <w:r>
+              <w:rPr>
+                <w:noProof/>
+                <w:webHidden/>
+              </w:rPr>
+              <w:fldChar w:fldCharType="begin"/>
+            </w:r>
+            <w:r>
+              <w:rPr>
+                <w:noProof/>
+                <w:webHidden/>
+              </w:rPr>
+              <w:instrText xml:space="preserve"> PAGEREF _Toc223970590 \h </w:instrText>
+            </w:r>
+            <w:r>
+              <w:rPr>
+                <w:noProof/>
+                <w:webHidden/>
+              </w:rPr>
+            </w:r>
+            <w:r>
+              <w:rPr>
+                <w:noProof/>
+                <w:webHidden/>
+              </w:rPr>
+              <w:fldChar w:fldCharType="separate"/>
+            </w:r>
+            <w:r>
+              <w:rPr>
+                <w:noProof/>
+                <w:webHidden/>
+              </w:rPr>
+              <w:t>3</w:t>
+            </w:r>
+            <w:r>
+              <w:rPr>
+                <w:noProof/>
+                <w:webHidden/>
+              </w:rPr>
+              <w:fldChar w:fldCharType="end"/>
+            </w:r>
+          </w:hyperlink>
+        </w:p>
+        <w:p>
+          <w:pPr>
+            <w:pStyle w:val="TDC1"/>
+            <w:tabs>
+              <w:tab w:val="right" w:leader="dot" w:pos="9394"/>
+            </w:tabs>
+            <w:rPr>
+              <w:noProof/>
+            </w:rPr>
+          </w:pPr>
+          <w:hyperlink w:anchor="_Toc223970591" w:history="1">
+            <w:r>
+              <w:rPr>
+                <w:rStyle w:val="Hipervnculo"/>
+                <w:noProof/>
+              </w:rPr>
+              <w:t>COMPONENTES PREDISENADOS</w:t>
+            </w:r>
+            <w:r>
+              <w:rPr>
+                <w:noProof/>
+                <w:webHidden/>
+              </w:rPr>
+              <w:tab/>
+            </w:r>
+            <w:r>
+              <w:rPr>
+                <w:noProof/>
+                <w:webHidden/>
+              </w:rPr>
+              <w:fldChar w:fldCharType="begin"/>
+            </w:r>
+            <w:r>
+              <w:rPr>
+                <w:noProof/>
+                <w:webHidden/>
+              </w:rPr>
+              <w:instrText xml:space="preserve"> PAGEREF _Toc223970591 \h </w:instrText>
+            </w:r>
+            <w:r>
+              <w:rPr>
+                <w:noProof/>
+                <w:webHidden/>
+              </w:rPr>
+            </w:r>
+            <w:r>
+              <w:rPr>
+                <w:noProof/>
+                <w:webHidden/>
+              </w:rPr>
+              <w:fldChar w:fldCharType="separate"/>
+            </w:r>
+            <w:r>
+              <w:rPr>
+                <w:noProof/>
+                <w:webHidden/>
+              </w:rPr>
+              <w:t>3</w:t>
+            </w:r>
+            <w:r>
+              <w:rPr>
+                <w:noProof/>
+                <w:webHidden/>
+              </w:rPr>
+              <w:fldChar w:fldCharType="end"/>
+            </w:r>
+          </w:hyperlink>
+        </w:p>
+        <w:p>
+          <w:pPr>
+            <w:pStyle w:val="TDC1"/>
+            <w:tabs>
+              <w:tab w:val="right" w:leader="dot" w:pos="9394"/>
+            </w:tabs>
+            <w:rPr>
+              <w:noProof/>
+            </w:rPr>
+          </w:pPr>
+          <w:hyperlink w:anchor="_Toc223970592" w:history="1">
+            <w:r>
+              <w:rPr>
+                <w:rStyle w:val="Hipervnculo"/>
+                <w:noProof/>
+              </w:rPr>
+              <w:t>ANIMACION DE FORMULARIOS</w:t>
+            </w:r>
+            <w:r>
+              <w:rPr>
+                <w:noProof/>
+                <w:webHidden/>
+              </w:rPr>
+              <w:tab/>
+            </w:r>
+            <w:r>
+              <w:rPr>
+                <w:noProof/>
+                <w:webHidden/>
+              </w:rPr>
+              <w:fldChar w:fldCharType="begin"/>
+            </w:r>
+            <w:r>
+              <w:rPr>
+                <w:noProof/>
+                <w:webHidden/>
+              </w:rPr>
+              <w:instrText xml:space="preserve"> PAGEREF _Toc223970592 \h </w:instrText>
+            </w:r>
+            <w:r>
+              <w:rPr>
+                <w:noProof/>
+                <w:webHidden/>
+              </w:rPr>
+            </w:r>
+            <w:r>
+              <w:rPr>
+                <w:noProof/>
+                <w:webHidden/>
+              </w:rPr>
+              <w:fldChar w:fldCharType="separate"/>
+            </w:r>
+            <w:r>
+              <w:rPr>
+                <w:noProof/>
+                <w:webHidden/>
+              </w:rPr>
+              <w:t>3</w:t>
+            </w:r>
+            <w:r>
+              <w:rPr>
+                <w:noProof/>
+                <w:webHidden/>
+              </w:rPr>
+              <w:fldChar w:fldCharType="end"/>
+            </w:r>
+          </w:hyperlink>
+        </w:p>
+        <w:p>
+          <w:pPr>
+            <w:pStyle w:val="TDC1"/>
+            <w:tabs>
+              <w:tab w:val="right" w:leader="dot" w:pos="9394"/>
+            </w:tabs>
+            <w:rPr>
+              <w:noProof/>
+            </w:rPr>
+          </w:pPr>
+          <w:hyperlink w:anchor="_Toc223970593" w:history="1">
+            <w:r>
+              <w:rPr>
+                <w:rStyle w:val="Hipervnculo"/>
+                <w:noProof/>
+              </w:rPr>
+              <w:t>TIPOS DE VALORES INPUT</w:t>
+            </w:r>
+            <w:r>
+              <w:rPr>
+                <w:noProof/>
+                <w:webHidden/>
+              </w:rPr>
+              <w:tab/>
+            </w:r>
+            <w:r>
+              <w:rPr>
+                <w:noProof/>
+                <w:webHidden/>
+              </w:rPr>
+              <w:fldChar w:fldCharType="begin"/>
+            </w:r>
+            <w:r>
+              <w:rPr>
+                <w:noProof/>
+                <w:webHidden/>
+              </w:rPr>
+              <w:instrText xml:space="preserve"> PAGEREF _Toc223970593 \h </w:instrText>
+            </w:r>
+            <w:r>
+              <w:rPr>
+                <w:noProof/>
+                <w:webHidden/>
+              </w:rPr>
+            </w:r>
+            <w:r>
+              <w:rPr>
+                <w:noProof/>
+                <w:webHidden/>
+              </w:rPr>
+              <w:fldChar w:fldCharType="separate"/>
+            </w:r>
+            <w:r>
+              <w:rPr>
+                <w:noProof/>
+                <w:webHidden/>
+              </w:rPr>
+              <w:t>4</w:t>
+            </w:r>
+            <w:r>
+              <w:rPr>
+                <w:noProof/>
+                <w:webHidden/>
+              </w:rPr>
+              <w:fldChar w:fldCharType="end"/>
+            </w:r>
+          </w:hyperlink>
+        </w:p>
+        <w:p>
+          <w:pPr>
+            <w:pStyle w:val="TDC1"/>
+            <w:tabs>
+              <w:tab w:val="right" w:leader="dot" w:pos="9394"/>
+            </w:tabs>
+            <w:rPr>
+              <w:noProof/>
+            </w:rPr>
+          </w:pPr>
+          <w:hyperlink w:anchor="_Toc223970594" w:history="1">
+            <w:r>
+              <w:rPr>
+                <w:rStyle w:val="Hipervnculo"/>
+                <w:noProof/>
+              </w:rPr>
+              <w:t>MENU TOGGLE</w:t>
+            </w:r>
+            <w:r>
+              <w:rPr>
+                <w:noProof/>
+                <w:webHidden/>
+              </w:rPr>
+              <w:tab/>
+            </w:r>
+            <w:r>
+              <w:rPr>
+                <w:noProof/>
+                <w:webHidden/>
+              </w:rPr>
+              <w:fldChar w:fldCharType="begin"/>
+            </w:r>
+            <w:r>
+              <w:rPr>
+                <w:noProof/>
+                <w:webHidden/>
+              </w:rPr>
+              <w:instrText xml:space="preserve"> PAGEREF _Toc223970594 \h </w:instrText>
+            </w:r>
+            <w:r>
+              <w:rPr>
+                <w:noProof/>
+                <w:webHidden/>
+              </w:rPr>
+            </w:r>
+            <w:r>
+              <w:rPr>
+                <w:noProof/>
+                <w:webHidden/>
+              </w:rPr>
+              <w:fldChar w:fldCharType="separate"/>
+            </w:r>
+            <w:r>
+              <w:rPr>
+                <w:noProof/>
+                <w:webHidden/>
+              </w:rPr>
+              <w:t>4</w:t>
+            </w:r>
+            <w:r>
+              <w:rPr>
+                <w:noProof/>
+                <w:webHidden/>
+              </w:rPr>
+              <w:fldChar w:fldCharType="end"/>
+            </w:r>
+          </w:hyperlink>
+        </w:p>
+        <w:p>
+          <w:pPr>
+            <w:ind w:left="0" w:firstLine="0"/>
+            <w:rPr>
+              <w:b/>
+              <w:bCs/>
+              <w:lang w:val="es-ES"/>
+            </w:rPr>
+          </w:pPr>
+          <w:r>
+            <w:rPr>
+              <w:b/>
+              <w:bCs/>
+              <w:lang w:val="es-ES"/>
+            </w:rPr>
+            <w:lastRenderedPageBreak/>
+            <w:fldChar w:fldCharType="end"/>
+          </w:r>
+        </w:p>
+      </w:sdtContent>
+    </w:sdt>
+    <w:p>
+      <w:r>
+        <w:br w:type="page"/>
+      </w:r>
+    </w:p>
+    <w:p>
+      <w:pPr>
+        <w:pStyle w:val="Ttulo1"/>
+      </w:pPr>
+      <w:bookmarkStart w:id="0" w:name="_Toc223970579"/>
+      <w:r>
+        <w:lastRenderedPageBreak/>
+        <w:t>CREACION DE FORMULARIO DE INICIO DE SESIÓN</w:t>
+      </w:r>
+      <w:bookmarkEnd w:id="0"/>
+    </w:p>
+    <w:p>
+      <w:pPr>
+        <w:pStyle w:val="Prrafodelista"/>
+        <w:numPr>
+          <w:ilvl w:val="0"/>
+          <w:numId w:val="3"/>
+        </w:numPr>
+        <w:rPr>
+          <w:rStyle w:val="Hipervnculo"/>
+          <w:color w:val="000000" w:themeColor="text1"/>
+          <w:u w:val="none"/>
+        </w:rPr>
+      </w:pPr>
+      <w:hyperlink r:id="rId6" w:history="1">
         <w:r>
           <w:rPr>
             <w:rStyle w:val="Hipervnculo"/>
@@ -19,10 +1193,37 @@
       </w:hyperlink>
     </w:p>
     <w:p>
-      <w:r>
-        <w:t xml:space="preserve">FORMULARIO STEP: </w:t>
-      </w:r>
-      <w:hyperlink r:id="rId5" w:history="1">
+      <w:pPr>
+        <w:pStyle w:val="Prrafodelista"/>
+        <w:numPr>
+          <w:ilvl w:val="0"/>
+          <w:numId w:val="3"/>
+        </w:numPr>
+      </w:pPr>
+      <w:hyperlink r:id="rId7" w:history="1">
+        <w:r>
+          <w:rPr>
+            <w:rStyle w:val="Hipervnculo"/>
+          </w:rPr>
+          <w:t>https://www.facebook.com/reel/1537818844216848</w:t>
+        </w:r>
+      </w:hyperlink>
+      <w:r>
+        <w:t xml:space="preserve"> </w:t>
+      </w:r>
+    </w:p>
+    <w:p>
+      <w:pPr>
+        <w:pStyle w:val="Ttulo1"/>
+      </w:pPr>
+      <w:bookmarkStart w:id="1" w:name="_Toc223970580"/>
+      <w:r>
+        <w:t>FORMULARIO STEP</w:t>
+      </w:r>
+      <w:bookmarkEnd w:id="1"/>
+    </w:p>
+    <w:p>
+      <w:hyperlink r:id="rId8" w:history="1">
         <w:r>
           <w:rPr>
             <w:rStyle w:val="Hipervnculo"/>
@@ -35,10 +1236,21 @@
       </w:r>
     </w:p>
     <w:p>
-      <w:r>
-        <w:t xml:space="preserve">CREACION DE FORMULARIO DE REGISTRO: </w:t>
-      </w:r>
-      <w:hyperlink r:id="rId6" w:history="1">
+      <w:pPr>
+        <w:ind w:left="1440" w:firstLine="0"/>
+      </w:pPr>
+      <w:bookmarkStart w:id="2" w:name="_Toc223970581"/>
+      <w:r>
+        <w:rPr>
+          <w:rStyle w:val="Ttulo1Car"/>
+        </w:rPr>
+        <w:t>CREACION DE FORMULARIO DE REGISTRO</w:t>
+      </w:r>
+      <w:bookmarkEnd w:id="2"/>
+      <w:r>
+        <w:t xml:space="preserve"> </w:t>
+      </w:r>
+      <w:hyperlink r:id="rId9" w:history="1">
         <w:r>
           <w:rPr>
             <w:rStyle w:val="Hipervnculo"/>
@@ -51,10 +1263,17 @@
       </w:r>
     </w:p>
     <w:p>
-      <w:r>
-        <w:t xml:space="preserve">RAZAS DE PERRO EXISTENTES: </w:t>
-      </w:r>
-      <w:hyperlink r:id="rId7" w:history="1">
+      <w:pPr>
+        <w:pStyle w:val="Ttulo1"/>
+      </w:pPr>
+      <w:bookmarkStart w:id="3" w:name="_Toc223970582"/>
+      <w:r>
+        <w:t>RAZAS DE PERRO EXISTENTES</w:t>
+      </w:r>
+      <w:bookmarkEnd w:id="3"/>
+    </w:p>
+    <w:p>
+      <w:hyperlink r:id="rId10" w:history="1">
         <w:r>
           <w:rPr>
             <w:rStyle w:val="Hipervnculo"/>
@@ -67,10 +1286,17 @@
       </w:r>
     </w:p>
     <w:p>
-      <w:r>
-        <w:t xml:space="preserve">RAZAS DE GATOS EXISTENTES: </w:t>
-      </w:r>
-      <w:hyperlink r:id="rId8" w:history="1">
+      <w:pPr>
+        <w:pStyle w:val="Ttulo1"/>
+      </w:pPr>
+      <w:bookmarkStart w:id="4" w:name="_Toc223970583"/>
+      <w:r>
+        <w:t>RAZAS DE GATOS EXISTENTES</w:t>
+      </w:r>
+      <w:bookmarkEnd w:id="4"/>
+    </w:p>
+    <w:p>
+      <w:hyperlink r:id="rId11" w:history="1">
         <w:r>
           <w:rPr>
             <w:rStyle w:val="Hipervnculo"/>
@@ -83,10 +1309,18 @@
       </w:r>
     </w:p>
     <w:p>
-      <w:r>
-        <w:t xml:space="preserve">RAZAS DE REPTILES Y ARTOPODOS: </w:t>
-      </w:r>
-      <w:hyperlink r:id="rId9" w:history="1">
+      <w:bookmarkStart w:id="5" w:name="_Toc223970584"/>
+      <w:r>
+        <w:rPr>
+          <w:rStyle w:val="Ttulo1Car"/>
+        </w:rPr>
+        <w:t>RAZAS DE REPTILES Y ARTOPODOS</w:t>
+      </w:r>
+      <w:bookmarkEnd w:id="5"/>
+      <w:r>
+        <w:t xml:space="preserve"> </w:t>
+      </w:r>
+      <w:hyperlink r:id="rId12" w:history="1">
         <w:r>
           <w:rPr>
             <w:rStyle w:val="Hipervnculo"/>
@@ -99,10 +1333,27 @@
       </w:r>
     </w:p>
     <w:p>
-      <w:r>
-        <w:t xml:space="preserve">CREACION DE MENU PRINCIPAL: </w:t>
-      </w:r>
-      <w:hyperlink r:id="rId10" w:history="1">
+      <w:pPr>
+        <w:pStyle w:val="Ttulo1"/>
+      </w:pPr>
+      <w:bookmarkStart w:id="6" w:name="_Toc223970585"/>
+      <w:r>
+        <w:t>CREACION DE MENU PRINCIPAL</w:t>
+      </w:r>
+      <w:bookmarkEnd w:id="6"/>
+      <w:r>
+        <w:t xml:space="preserve"> </w:t>
+      </w:r>
+    </w:p>
+    <w:p>
+      <w:pPr>
+        <w:pStyle w:val="Prrafodelista"/>
+        <w:numPr>
+          <w:ilvl w:val="0"/>
+          <w:numId w:val="1"/>
+        </w:numPr>
+      </w:pPr>
+      <w:hyperlink r:id="rId13" w:history="1">
         <w:r>
           <w:rPr>
             <w:rStyle w:val="Hipervnculo"/>
@@ -115,13 +1366,42 @@
       </w:r>
     </w:p>
     <w:p>
-      <w:r>
-        <w:t>SEPARAR POR LINEAS LOS PARRAFOS:</w:t>
-      </w:r>
+      <w:pPr>
+        <w:pStyle w:val="Prrafodelista"/>
+        <w:numPr>
+          <w:ilvl w:val="0"/>
+          <w:numId w:val="1"/>
+        </w:numPr>
+      </w:pPr>
+      <w:hyperlink r:id="rId14" w:history="1">
+        <w:r>
+          <w:rPr>
+            <w:rStyle w:val="Hipervnculo"/>
+          </w:rPr>
+          <w:t>https://www.facebook.com/reel/4347632878850943</w:t>
+        </w:r>
+      </w:hyperlink>
       <w:r>
         <w:t xml:space="preserve"> </w:t>
       </w:r>
-      <w:hyperlink r:id="rId11" w:history="1">
+    </w:p>
+    <w:p>
+      <w:pPr>
+        <w:ind w:left="1440" w:firstLine="0"/>
+      </w:pPr>
+      <w:bookmarkStart w:id="7" w:name="_Toc223970586"/>
+      <w:r>
+        <w:rPr>
+          <w:rStyle w:val="Ttulo1Car"/>
+        </w:rPr>
+        <w:lastRenderedPageBreak/>
+        <w:t>SEPARAR POR LINEAS LOS PARRAFOS</w:t>
+      </w:r>
+      <w:bookmarkEnd w:id="7"/>
+      <w:r>
+        <w:t xml:space="preserve"> </w:t>
+      </w:r>
+      <w:hyperlink r:id="rId15" w:history="1">
         <w:r>
           <w:rPr>
             <w:rStyle w:val="Hipervnculo"/>
@@ -134,15 +1414,226 @@
       </w:r>
     </w:p>
     <w:p>
-      <w:r>
-        <w:t xml:space="preserve">INSERCION DE FUENTES EXTERNAS: </w:t>
-      </w:r>
-      <w:hyperlink r:id="rId12" w:history="1">
+      <w:pPr>
+        <w:ind w:left="1440" w:firstLine="0"/>
+      </w:pPr>
+      <w:bookmarkStart w:id="8" w:name="_Toc223970587"/>
+      <w:r>
+        <w:rPr>
+          <w:rStyle w:val="Ttulo1Car"/>
+        </w:rPr>
+        <w:t>INSERCION DE FUENTES EXTERNAS:</w:t>
+      </w:r>
+      <w:bookmarkEnd w:id="8"/>
+      <w:r>
+        <w:t xml:space="preserve"> </w:t>
+      </w:r>
+      <w:hyperlink r:id="rId16" w:history="1">
         <w:r>
           <w:rPr>
             <w:rStyle w:val="Hipervnculo"/>
           </w:rPr>
           <w:t>https://www.youtube.com/watch?v=LffuwO_m-k8</w:t>
+        </w:r>
+      </w:hyperlink>
+      <w:r>
+        <w:t xml:space="preserve"> </w:t>
+      </w:r>
+    </w:p>
+    <w:p>
+      <w:pPr>
+        <w:ind w:left="1440" w:firstLine="0"/>
+      </w:pPr>
+      <w:bookmarkStart w:id="9" w:name="_Toc223970588"/>
+      <w:r>
+        <w:rPr>
+          <w:rStyle w:val="Ttulo1Car"/>
+        </w:rPr>
+        <w:t>HACER QUE GOOGLE CONOZCA LA PAGINA</w:t>
+      </w:r>
+      <w:bookmarkEnd w:id="9"/>
+      <w:r>
+        <w:t xml:space="preserve"> </w:t>
+      </w:r>
+      <w:hyperlink r:id="rId17" w:history="1">
+        <w:r>
+          <w:rPr>
+            <w:rStyle w:val="Hipervnculo"/>
+          </w:rPr>
+          <w:t>https://www.facebook.com/share/r/14XEwU4zCQE/</w:t>
+        </w:r>
+      </w:hyperlink>
+      <w:r>
+        <w:t xml:space="preserve"> </w:t>
+      </w:r>
+    </w:p>
+    <w:p>
+      <w:pPr>
+        <w:pStyle w:val="Ttulo1"/>
+      </w:pPr>
+      <w:bookmarkStart w:id="10" w:name="_Toc223970589"/>
+      <w:r>
+        <w:t>AGREGAR DESLIZAMIENTO CON BOTON</w:t>
+      </w:r>
+      <w:bookmarkEnd w:id="10"/>
+    </w:p>
+    <w:p>
+      <w:pPr>
+        <w:ind w:left="1440" w:firstLine="0"/>
+      </w:pPr>
+      <w:hyperlink r:id="rId18" w:history="1">
+        <w:r>
+          <w:rPr>
+            <w:rStyle w:val="Hipervnculo"/>
+          </w:rPr>
+          <w:t>https://www.facebook.com/reel/2704975816510319</w:t>
+        </w:r>
+      </w:hyperlink>
+      <w:r>
+        <w:t xml:space="preserve"> </w:t>
+      </w:r>
+    </w:p>
+    <w:p>
+      <w:pPr>
+        <w:ind w:left="1440" w:firstLine="0"/>
+      </w:pPr>
+      <w:hyperlink r:id="rId19" w:history="1">
+        <w:r>
+          <w:rPr>
+            <w:rStyle w:val="Hipervnculo"/>
+          </w:rPr>
+          <w:t>https://www.facebook.com/reel/1878902249655747</w:t>
+        </w:r>
+      </w:hyperlink>
+      <w:r>
+        <w:t xml:space="preserve"> </w:t>
+      </w:r>
+    </w:p>
+    <w:p>
+      <w:pPr>
+        <w:pStyle w:val="Ttulo1"/>
+      </w:pPr>
+      <w:bookmarkStart w:id="11" w:name="_Toc223970590"/>
+      <w:r>
+        <w:t>OCULTAR O MOSTRAR UNA CONTRASENA</w:t>
+      </w:r>
+      <w:bookmarkEnd w:id="11"/>
+    </w:p>
+    <w:p>
+      <w:pPr>
+        <w:ind w:left="1440" w:firstLine="0"/>
+      </w:pPr>
+      <w:hyperlink r:id="rId20" w:history="1">
+        <w:r>
+          <w:rPr>
+            <w:rStyle w:val="Hipervnculo"/>
+          </w:rPr>
+          <w:t>https://www.facebook.com/reel/848744134716602</w:t>
+        </w:r>
+      </w:hyperlink>
+      <w:r>
+        <w:t xml:space="preserve"> </w:t>
+      </w:r>
+    </w:p>
+    <w:p>
+      <w:pPr>
+        <w:pStyle w:val="Ttulo1"/>
+      </w:pPr>
+      <w:bookmarkStart w:id="12" w:name="_Toc223970591"/>
+      <w:r>
+        <w:t>COMPONENTES PREDISENADOS</w:t>
+      </w:r>
+      <w:bookmarkEnd w:id="12"/>
+    </w:p>
+    <w:p>
+      <w:pPr>
+        <w:ind w:left="1440" w:firstLine="0"/>
+      </w:pPr>
+      <w:hyperlink r:id="rId21" w:history="1">
+        <w:r>
+          <w:rPr>
+            <w:rStyle w:val="Hipervnculo"/>
+          </w:rPr>
+          <w:t>https://www.facebook.com/reel/928070823213252</w:t>
+        </w:r>
+      </w:hyperlink>
+      <w:r>
+        <w:t xml:space="preserve"> </w:t>
+      </w:r>
+    </w:p>
+    <w:p>
+      <w:pPr>
+        <w:pStyle w:val="Ttulo1"/>
+      </w:pPr>
+      <w:bookmarkStart w:id="13" w:name="_Toc223970592"/>
+      <w:r>
+        <w:t>ANIMACION DE FORMULARIOS</w:t>
+      </w:r>
+      <w:bookmarkEnd w:id="13"/>
+    </w:p>
+    <w:p>
+      <w:pPr>
+        <w:ind w:left="1440" w:firstLine="0"/>
+      </w:pPr>
+      <w:hyperlink r:id="rId22" w:history="1">
+        <w:r>
+          <w:rPr>
+            <w:rStyle w:val="Hipervnculo"/>
+          </w:rPr>
+          <w:t>https://www.facebook.com/reel/1582135226538524</w:t>
+        </w:r>
+      </w:hyperlink>
+      <w:r>
+        <w:t xml:space="preserve"> </w:t>
+      </w:r>
+    </w:p>
+    <w:p>
+      <w:pPr>
+        <w:pStyle w:val="Ttulo1"/>
+      </w:pPr>
+      <w:bookmarkStart w:id="14" w:name="_Toc223970593"/>
+      <w:r>
+        <w:lastRenderedPageBreak/>
+        <w:t>TIPOS DE VALORES INPUT</w:t>
+      </w:r>
+      <w:bookmarkEnd w:id="14"/>
+    </w:p>
+    <w:p>
+      <w:pPr>
+        <w:ind w:left="1440" w:firstLine="0"/>
+      </w:pPr>
+      <w:hyperlink r:id="rId23" w:history="1">
+        <w:r>
+          <w:rPr>
+            <w:rStyle w:val="Hipervnculo"/>
+          </w:rPr>
+          <w:t>https://www.facebook.com/reel/2098336924038814</w:t>
+        </w:r>
+      </w:hyperlink>
+      <w:r>
+        <w:t xml:space="preserve"> </w:t>
+      </w:r>
+    </w:p>
+    <w:p>
+      <w:pPr>
+        <w:pStyle w:val="Ttulo1"/>
+      </w:pPr>
+      <w:bookmarkStart w:id="15" w:name="_Toc223970594"/>
+      <w:r>
+        <w:t>MENU TOGGLE</w:t>
+      </w:r>
+      <w:bookmarkEnd w:id="15"/>
+    </w:p>
+    <w:p>
+      <w:pPr>
+        <w:ind w:left="1440" w:firstLine="0"/>
+      </w:pPr>
+      <w:hyperlink r:id="rId24" w:history="1">
+        <w:r>
+          <w:rPr>
+            <w:rStyle w:val="Hipervnculo"/>
+          </w:rPr>
+          <w:t>https://www.facebook.com/reel/1712008609516777</w:t>
         </w:r>
       </w:hyperlink>
       <w:r>
@@ -158,6 +1649,284 @@
     </w:sectPr>
   </w:body>
 </w:document>
+</file>
+
+<file path=word/numbering.xml><?xml version="1.0" encoding="utf-8"?>
+<w:numbering xmlns:wpc="http://schemas.microsoft.com/office/word/2010/wordprocessingCanvas" xmlns:cx="http://schemas.microsoft.com/office/drawing/2014/chartex" xmlns:cx1="http://schemas.microsoft.com/office/drawing/2015/9/8/chartex" xmlns:cx2="http://schemas.microsoft.com/office/drawing/2015/10/21/chartex" xmlns:cx3="http://schemas.microsoft.com/office/drawing/2016/5/9/chartex" xmlns:cx4="http://schemas.microsoft.com/office/drawing/2016/5/10/chartex" xmlns:cx5="http://schemas.microsoft.com/office/drawing/2016/5/11/chartex" xmlns:cx6="http://schemas.microsoft.com/office/drawing/2016/5/12/chartex" xmlns:cx7="http://schemas.microsoft.com/office/drawing/2016/5/13/chartex" xmlns:cx8="http://schemas.microsoft.com/office/drawing/2016/5/14/chartex" xmlns:mc="http://schemas.openxmlformats.org/markup-compatibility/2006" xmlns:aink="http://schemas.microsoft.com/office/drawing/2016/ink" xmlns:am3d="http://schemas.microsoft.com/office/drawing/2017/model3d" xmlns:o="urn:schemas-microsoft-com:office:office" xmlns:oel="http://schemas.microsoft.com/office/2019/extlst" xmlns:r="http://schemas.openxmlformats.org/officeDocument/2006/relationships" xmlns:m="http://schemas.openxmlformats.org/officeDocument/2006/math" xmlns:v="urn:schemas-microsoft-com:vml" xmlns:wp14="http://schemas.microsoft.com/office/word/2010/wordprocessingDrawing" xmlns:wp="http://schemas.openxmlformats.org/drawingml/2006/wordprocessingDrawing" xmlns:w10="urn:schemas-microsoft-com:office:word" xmlns:w="http://schemas.openxmlformats.org/wordprocessingml/2006/main" xmlns:w14="http://schemas.microsoft.com/office/word/2010/wordml" xmlns:w15="http://schemas.microsoft.com/office/word/2012/wordml" xmlns:w16cex="http://schemas.microsoft.com/office/word/2018/wordml/cex" xmlns:w16cid="http://schemas.microsoft.com/office/word/2016/wordml/cid" xmlns:w16="http://schemas.microsoft.com/office/word/2018/wordml" xmlns:w16sdtdh="http://schemas.microsoft.com/office/word/2020/wordml/sdtdatahash" xmlns:w16se="http://schemas.microsoft.com/office/word/2015/wordml/symex" xmlns:wpg="http://schemas.microsoft.com/office/word/2010/wordprocessingGroup" xmlns:wpi="http://schemas.microsoft.com/office/word/2010/wordprocessingInk" xmlns:wne="http://schemas.microsoft.com/office/word/2006/wordml" xmlns:wps="http://schemas.microsoft.com/office/word/2010/wordprocessingShape" mc:Ignorable="w14 w15 w16se w16cid w16 w16cex w16sdtdh wp14">
+  <w:abstractNum w:abstractNumId="0" w15:restartNumberingAfterBreak="0">
+    <w:nsid w:val="07504110"/>
+    <w:multiLevelType w:val="hybridMultilevel"/>
+    <w:tmpl w:val="16E6E2B4"/>
+    <w:lvl w:ilvl="0" w:tplc="410A9942">
+      <w:start w:val="1"/>
+      <w:numFmt w:val="decimal"/>
+      <w:lvlText w:val="%1."/>
+      <w:lvlJc w:val="left"/>
+      <w:pPr>
+        <w:ind w:left="1800" w:hanging="360"/>
+      </w:pPr>
+      <w:rPr>
+        <w:rFonts w:hint="default"/>
+      </w:rPr>
+    </w:lvl>
+    <w:lvl w:ilvl="1" w:tplc="080A0019" w:tentative="1">
+      <w:start w:val="1"/>
+      <w:numFmt w:val="lowerLetter"/>
+      <w:lvlText w:val="%2."/>
+      <w:lvlJc w:val="left"/>
+      <w:pPr>
+        <w:ind w:left="2520" w:hanging="360"/>
+      </w:pPr>
+    </w:lvl>
+    <w:lvl w:ilvl="2" w:tplc="080A001B" w:tentative="1">
+      <w:start w:val="1"/>
+      <w:numFmt w:val="lowerRoman"/>
+      <w:lvlText w:val="%3."/>
+      <w:lvlJc w:val="right"/>
+      <w:pPr>
+        <w:ind w:left="3240" w:hanging="180"/>
+      </w:pPr>
+    </w:lvl>
+    <w:lvl w:ilvl="3" w:tplc="080A000F" w:tentative="1">
+      <w:start w:val="1"/>
+      <w:numFmt w:val="decimal"/>
+      <w:lvlText w:val="%4."/>
+      <w:lvlJc w:val="left"/>
+      <w:pPr>
+        <w:ind w:left="3960" w:hanging="360"/>
+      </w:pPr>
+    </w:lvl>
+    <w:lvl w:ilvl="4" w:tplc="080A0019" w:tentative="1">
+      <w:start w:val="1"/>
+      <w:numFmt w:val="lowerLetter"/>
+      <w:lvlText w:val="%5."/>
+      <w:lvlJc w:val="left"/>
+      <w:pPr>
+        <w:ind w:left="4680" w:hanging="360"/>
+      </w:pPr>
+    </w:lvl>
+    <w:lvl w:ilvl="5" w:tplc="080A001B" w:tentative="1">
+      <w:start w:val="1"/>
+      <w:numFmt w:val="lowerRoman"/>
+      <w:lvlText w:val="%6."/>
+      <w:lvlJc w:val="right"/>
+      <w:pPr>
+        <w:ind w:left="5400" w:hanging="180"/>
+      </w:pPr>
+    </w:lvl>
+    <w:lvl w:ilvl="6" w:tplc="080A000F" w:tentative="1">
+      <w:start w:val="1"/>
+      <w:numFmt w:val="decimal"/>
+      <w:lvlText w:val="%7."/>
+      <w:lvlJc w:val="left"/>
+      <w:pPr>
+        <w:ind w:left="6120" w:hanging="360"/>
+      </w:pPr>
+    </w:lvl>
+    <w:lvl w:ilvl="7" w:tplc="080A0019" w:tentative="1">
+      <w:start w:val="1"/>
+      <w:numFmt w:val="lowerLetter"/>
+      <w:lvlText w:val="%8."/>
+      <w:lvlJc w:val="left"/>
+      <w:pPr>
+        <w:ind w:left="6840" w:hanging="360"/>
+      </w:pPr>
+    </w:lvl>
+    <w:lvl w:ilvl="8" w:tplc="080A001B" w:tentative="1">
+      <w:start w:val="1"/>
+      <w:numFmt w:val="lowerRoman"/>
+      <w:lvlText w:val="%9."/>
+      <w:lvlJc w:val="right"/>
+      <w:pPr>
+        <w:ind w:left="7560" w:hanging="180"/>
+      </w:pPr>
+    </w:lvl>
+  </w:abstractNum>
+  <w:abstractNum w:abstractNumId="1" w15:restartNumberingAfterBreak="0">
+    <w:nsid w:val="28E16EDB"/>
+    <w:multiLevelType w:val="hybridMultilevel"/>
+    <w:tmpl w:val="231A1DC0"/>
+    <w:lvl w:ilvl="0" w:tplc="BE8CB44E">
+      <w:start w:val="1"/>
+      <w:numFmt w:val="decimal"/>
+      <w:lvlText w:val="%1."/>
+      <w:lvlJc w:val="left"/>
+      <w:pPr>
+        <w:ind w:left="1800" w:hanging="360"/>
+      </w:pPr>
+      <w:rPr>
+        <w:rFonts w:ascii="Arial" w:eastAsiaTheme="minorHAnsi" w:hAnsi="Arial" w:cs="Arial"/>
+      </w:rPr>
+    </w:lvl>
+    <w:lvl w:ilvl="1" w:tplc="080A0019">
+      <w:start w:val="1"/>
+      <w:numFmt w:val="lowerLetter"/>
+      <w:lvlText w:val="%2."/>
+      <w:lvlJc w:val="left"/>
+      <w:pPr>
+        <w:ind w:left="1440" w:hanging="360"/>
+      </w:pPr>
+    </w:lvl>
+    <w:lvl w:ilvl="2" w:tplc="080A001B">
+      <w:start w:val="1"/>
+      <w:numFmt w:val="lowerRoman"/>
+      <w:lvlText w:val="%3."/>
+      <w:lvlJc w:val="right"/>
+      <w:pPr>
+        <w:ind w:left="2160" w:hanging="180"/>
+      </w:pPr>
+    </w:lvl>
+    <w:lvl w:ilvl="3" w:tplc="080A000F" w:tentative="1">
+      <w:start w:val="1"/>
+      <w:numFmt w:val="decimal"/>
+      <w:lvlText w:val="%4."/>
+      <w:lvlJc w:val="left"/>
+      <w:pPr>
+        <w:ind w:left="2880" w:hanging="360"/>
+      </w:pPr>
+    </w:lvl>
+    <w:lvl w:ilvl="4" w:tplc="080A0019" w:tentative="1">
+      <w:start w:val="1"/>
+      <w:numFmt w:val="lowerLetter"/>
+      <w:lvlText w:val="%5."/>
+      <w:lvlJc w:val="left"/>
+      <w:pPr>
+        <w:ind w:left="3600" w:hanging="360"/>
+      </w:pPr>
+    </w:lvl>
+    <w:lvl w:ilvl="5" w:tplc="080A001B" w:tentative="1">
+      <w:start w:val="1"/>
+      <w:numFmt w:val="lowerRoman"/>
+      <w:lvlText w:val="%6."/>
+      <w:lvlJc w:val="right"/>
+      <w:pPr>
+        <w:ind w:left="4320" w:hanging="180"/>
+      </w:pPr>
+    </w:lvl>
+    <w:lvl w:ilvl="6" w:tplc="080A000F" w:tentative="1">
+      <w:start w:val="1"/>
+      <w:numFmt w:val="decimal"/>
+      <w:lvlText w:val="%7."/>
+      <w:lvlJc w:val="left"/>
+      <w:pPr>
+        <w:ind w:left="5040" w:hanging="360"/>
+      </w:pPr>
+    </w:lvl>
+    <w:lvl w:ilvl="7" w:tplc="080A0019" w:tentative="1">
+      <w:start w:val="1"/>
+      <w:numFmt w:val="lowerLetter"/>
+      <w:lvlText w:val="%8."/>
+      <w:lvlJc w:val="left"/>
+      <w:pPr>
+        <w:ind w:left="5760" w:hanging="360"/>
+      </w:pPr>
+    </w:lvl>
+    <w:lvl w:ilvl="8" w:tplc="080A001B" w:tentative="1">
+      <w:start w:val="1"/>
+      <w:numFmt w:val="lowerRoman"/>
+      <w:lvlText w:val="%9."/>
+      <w:lvlJc w:val="right"/>
+      <w:pPr>
+        <w:ind w:left="6480" w:hanging="180"/>
+      </w:pPr>
+    </w:lvl>
+  </w:abstractNum>
+  <w:abstractNum w:abstractNumId="2" w15:restartNumberingAfterBreak="0">
+    <w:nsid w:val="3FAE3A16"/>
+    <w:multiLevelType w:val="hybridMultilevel"/>
+    <w:tmpl w:val="4934A4C0"/>
+    <w:lvl w:ilvl="0" w:tplc="080A000F">
+      <w:start w:val="1"/>
+      <w:numFmt w:val="decimal"/>
+      <w:lvlText w:val="%1."/>
+      <w:lvlJc w:val="left"/>
+      <w:pPr>
+        <w:ind w:left="1800" w:hanging="360"/>
+      </w:pPr>
+    </w:lvl>
+    <w:lvl w:ilvl="1" w:tplc="080A0019" w:tentative="1">
+      <w:start w:val="1"/>
+      <w:numFmt w:val="lowerLetter"/>
+      <w:lvlText w:val="%2."/>
+      <w:lvlJc w:val="left"/>
+      <w:pPr>
+        <w:ind w:left="2520" w:hanging="360"/>
+      </w:pPr>
+    </w:lvl>
+    <w:lvl w:ilvl="2" w:tplc="080A001B" w:tentative="1">
+      <w:start w:val="1"/>
+      <w:numFmt w:val="lowerRoman"/>
+      <w:lvlText w:val="%3."/>
+      <w:lvlJc w:val="right"/>
+      <w:pPr>
+        <w:ind w:left="3240" w:hanging="180"/>
+      </w:pPr>
+    </w:lvl>
+    <w:lvl w:ilvl="3" w:tplc="080A000F" w:tentative="1">
+      <w:start w:val="1"/>
+      <w:numFmt w:val="decimal"/>
+      <w:lvlText w:val="%4."/>
+      <w:lvlJc w:val="left"/>
+      <w:pPr>
+        <w:ind w:left="3960" w:hanging="360"/>
+      </w:pPr>
+    </w:lvl>
+    <w:lvl w:ilvl="4" w:tplc="080A0019" w:tentative="1">
+      <w:start w:val="1"/>
+      <w:numFmt w:val="lowerLetter"/>
+      <w:lvlText w:val="%5."/>
+      <w:lvlJc w:val="left"/>
+      <w:pPr>
+        <w:ind w:left="4680" w:hanging="360"/>
+      </w:pPr>
+    </w:lvl>
+    <w:lvl w:ilvl="5" w:tplc="080A001B" w:tentative="1">
+      <w:start w:val="1"/>
+      <w:numFmt w:val="lowerRoman"/>
+      <w:lvlText w:val="%6."/>
+      <w:lvlJc w:val="right"/>
+      <w:pPr>
+        <w:ind w:left="5400" w:hanging="180"/>
+      </w:pPr>
+    </w:lvl>
+    <w:lvl w:ilvl="6" w:tplc="080A000F" w:tentative="1">
+      <w:start w:val="1"/>
+      <w:numFmt w:val="decimal"/>
+      <w:lvlText w:val="%7."/>
+      <w:lvlJc w:val="left"/>
+      <w:pPr>
+        <w:ind w:left="6120" w:hanging="360"/>
+      </w:pPr>
+    </w:lvl>
+    <w:lvl w:ilvl="7" w:tplc="080A0019" w:tentative="1">
+      <w:start w:val="1"/>
+      <w:numFmt w:val="lowerLetter"/>
+      <w:lvlText w:val="%8."/>
+      <w:lvlJc w:val="left"/>
+      <w:pPr>
+        <w:ind w:left="6840" w:hanging="360"/>
+      </w:pPr>
+    </w:lvl>
+    <w:lvl w:ilvl="8" w:tplc="080A001B" w:tentative="1">
+      <w:start w:val="1"/>
+      <w:numFmt w:val="lowerRoman"/>
+      <w:lvlText w:val="%9."/>
+      <w:lvlJc w:val="right"/>
+      <w:pPr>
+        <w:ind w:left="7560" w:hanging="180"/>
+      </w:pPr>
+    </w:lvl>
+  </w:abstractNum>
+  <w:num w:numId="1" w16cid:durableId="716705729">
+    <w:abstractNumId w:val="0"/>
+  </w:num>
+  <w:num w:numId="2" w16cid:durableId="956175535">
+    <w:abstractNumId w:val="1"/>
+  </w:num>
+  <w:num w:numId="3" w16cid:durableId="79107808">
+    <w:abstractNumId w:val="2"/>
+  </w:num>
+</w:numbering>
 </file>
 
 <file path=word/styles.xml><?xml version="1.0" encoding="utf-8"?>
@@ -572,6 +2341,26 @@
       <w:sz w:val="22"/>
     </w:rPr>
   </w:style>
+  <w:style w:type="paragraph" w:styleId="Ttulo1">
+    <w:name w:val="heading 1"/>
+    <w:basedOn w:val="Normal"/>
+    <w:next w:val="Normal"/>
+    <w:link w:val="Ttulo1Car"/>
+    <w:uiPriority w:val="9"/>
+    <w:qFormat/>
+    <w:rsid w:val="002B01BB"/>
+    <w:pPr>
+      <w:keepNext/>
+      <w:keepLines/>
+      <w:outlineLvl w:val="0"/>
+    </w:pPr>
+    <w:rPr>
+      <w:rFonts w:asciiTheme="majorHAnsi" w:eastAsiaTheme="majorEastAsia" w:hAnsiTheme="majorHAnsi" w:cstheme="majorBidi"/>
+      <w:color w:val="0F4761" w:themeColor="accent1" w:themeShade="BF"/>
+      <w:sz w:val="32"/>
+      <w:szCs w:val="32"/>
+    </w:rPr>
+  </w:style>
   <w:style w:type="paragraph" w:styleId="Ttulo2">
     <w:name w:val="heading 2"/>
     <w:basedOn w:val="Normal"/>
@@ -598,6 +2387,7 @@
   <w:style w:type="character" w:default="1" w:styleId="Fuentedeprrafopredeter">
     <w:name w:val="Default Paragraph Font"/>
     <w:uiPriority w:val="1"/>
+    <w:semiHidden/>
     <w:unhideWhenUsed/>
   </w:style>
   <w:style w:type="table" w:default="1" w:styleId="Tablanormal">
@@ -706,6 +2496,59 @@
       <w:color w:val="605E5C"/>
       <w:shd w:val="clear" w:color="auto" w:fill="E1DFDD"/>
     </w:rPr>
+  </w:style>
+  <w:style w:type="paragraph" w:styleId="Prrafodelista">
+    <w:name w:val="List Paragraph"/>
+    <w:basedOn w:val="Normal"/>
+    <w:uiPriority w:val="34"/>
+    <w:qFormat/>
+    <w:rsid w:val="003441D2"/>
+    <w:pPr>
+      <w:contextualSpacing/>
+    </w:pPr>
+  </w:style>
+  <w:style w:type="character" w:customStyle="1" w:styleId="Ttulo1Car">
+    <w:name w:val="Título 1 Car"/>
+    <w:basedOn w:val="Fuentedeprrafopredeter"/>
+    <w:link w:val="Ttulo1"/>
+    <w:uiPriority w:val="9"/>
+    <w:rsid w:val="002B01BB"/>
+    <w:rPr>
+      <w:rFonts w:asciiTheme="majorHAnsi" w:eastAsiaTheme="majorEastAsia" w:hAnsiTheme="majorHAnsi" w:cstheme="majorBidi"/>
+      <w:color w:val="0F4761" w:themeColor="accent1" w:themeShade="BF"/>
+      <w:sz w:val="32"/>
+      <w:szCs w:val="32"/>
+    </w:rPr>
+  </w:style>
+  <w:style w:type="paragraph" w:styleId="TtuloTDC">
+    <w:name w:val="TOC Heading"/>
+    <w:basedOn w:val="Ttulo1"/>
+    <w:next w:val="Normal"/>
+    <w:uiPriority w:val="39"/>
+    <w:unhideWhenUsed/>
+    <w:qFormat/>
+    <w:rsid w:val="00952CD8"/>
+    <w:pPr>
+      <w:spacing w:line="259" w:lineRule="auto"/>
+      <w:ind w:left="0" w:firstLine="0"/>
+      <w:outlineLvl w:val="9"/>
+    </w:pPr>
+    <w:rPr>
+      <w:lang w:eastAsia="es-MX"/>
+    </w:rPr>
+  </w:style>
+  <w:style w:type="paragraph" w:styleId="TDC1">
+    <w:name w:val="toc 1"/>
+    <w:basedOn w:val="Normal"/>
+    <w:next w:val="Normal"/>
+    <w:autoRedefine/>
+    <w:uiPriority w:val="39"/>
+    <w:unhideWhenUsed/>
+    <w:rsid w:val="00952CD8"/>
+    <w:pPr>
+      <w:spacing w:after="100"/>
+      <w:ind w:left="0"/>
+    </w:pPr>
   </w:style>
 </w:styles>
 </file>
@@ -1003,4 +2846,16 @@
     </a:ext>
   </a:extLst>
 </a:theme>
+</file>
+
+<file path=customXml/item1.xml><?xml version="1.0" encoding="utf-8"?>
+<b:Sources xmlns:b="http://schemas.openxmlformats.org/officeDocument/2006/bibliography" xmlns="http://schemas.openxmlformats.org/officeDocument/2006/bibliography" SelectedStyle="\APASixthEditionOfficeOnline.xsl" StyleName="APA" Version="6"/>
+</file>
+
+<file path=customXml/itemProps1.xml><?xml version="1.0" encoding="utf-8"?>
+<ds:datastoreItem xmlns:ds="http://schemas.openxmlformats.org/officeDocument/2006/customXml" ds:itemID="{D82A45E6-1FF0-4A26-8B4D-7D4500237621}">
+  <ds:schemaRefs>
+    <ds:schemaRef ds:uri="http://schemas.openxmlformats.org/officeDocument/2006/bibliography"/>
+  </ds:schemaRefs>
+</ds:datastoreItem>
 </file>
</xml_diff>

<commit_message>
Cambio en menu principal
</commit_message>
<xml_diff>
--- a/Bibliografia.docx
+++ b/Bibliografia.docx
@@ -5,7 +5,11 @@
     <w:sdt>
       <w:sdtPr>
         <w:rPr>
-          <w:lang w:val="es-ES"/>
+          <w:rFonts w:ascii="Arial" w:eastAsiaTheme="minorHAnsi" w:hAnsi="Arial" w:cs="Arial"/>
+          <w:color w:val="000000" w:themeColor="text1"/>
+          <w:sz w:val="22"/>
+          <w:szCs w:val="24"/>
+          <w:lang w:val="es-ES" w:eastAsia="en-US"/>
         </w:rPr>
         <w:id w:val="-2107264035"/>
         <w:docPartObj>
@@ -15,13 +19,8 @@
       </w:sdtPr>
       <w:sdtEndPr>
         <w:rPr>
-          <w:rFonts w:ascii="Arial" w:eastAsiaTheme="minorHAnsi" w:hAnsi="Arial" w:cs="Arial"/>
           <w:b/>
           <w:bCs/>
-          <w:color w:val="000000" w:themeColor="text1"/>
-          <w:sz w:val="22"/>
-          <w:szCs w:val="24"/>
-          <w:lang w:eastAsia="en-US"/>
         </w:rPr>
       </w:sdtEndPr>
       <w:sdtContent>
@@ -1633,7 +1632,40 @@
           <w:rPr>
             <w:rStyle w:val="Hipervnculo"/>
           </w:rPr>
-          <w:t>https://www.facebook.com/reel/1712008609516777</w:t>
+          <w:t>https://www.face</w:t>
+        </w:r>
+        <w:r>
+          <w:rPr>
+            <w:rStyle w:val="Hipervnculo"/>
+          </w:rPr>
+          <w:t>b</w:t>
+        </w:r>
+        <w:r>
+          <w:rPr>
+            <w:rStyle w:val="Hipervnculo"/>
+          </w:rPr>
+          <w:t>ook.com/reel/1712008609516777</w:t>
+        </w:r>
+      </w:hyperlink>
+      <w:r>
+        <w:t xml:space="preserve"> </w:t>
+      </w:r>
+    </w:p>
+    <w:p>
+      <w:pPr>
+        <w:pStyle w:val="Ttulo1"/>
+      </w:pPr>
+      <w:r>
+        <w:t>CALENDARIO CON CSS.</w:t>
+      </w:r>
+    </w:p>
+    <w:p>
+      <w:hyperlink r:id="rId25" w:history="1">
+        <w:r>
+          <w:rPr>
+            <w:rStyle w:val="Hipervnculo"/>
+          </w:rPr>
+          <w:t>https://www.youtube.com/watch?v=Bpyl59_fjvU</w:t>
         </w:r>
       </w:hyperlink>
       <w:r>
@@ -2550,6 +2582,18 @@
       <w:ind w:left="0"/>
     </w:pPr>
   </w:style>
+  <w:style w:type="character" w:styleId="Hipervnculovisitado">
+    <w:name w:val="FollowedHyperlink"/>
+    <w:basedOn w:val="Fuentedeprrafopredeter"/>
+    <w:uiPriority w:val="99"/>
+    <w:semiHidden/>
+    <w:unhideWhenUsed/>
+    <w:rsid w:val="00214061"/>
+    <w:rPr>
+      <w:color w:val="96607D" w:themeColor="followedHyperlink"/>
+      <w:u w:val="single"/>
+    </w:rPr>
+  </w:style>
 </w:styles>
 </file>
 

</xml_diff>

<commit_message>
Cambios en menu principal
</commit_message>
<xml_diff>
--- a/Bibliografia.docx
+++ b/Bibliografia.docx
@@ -1165,6 +1165,27 @@
       <w:bookmarkStart w:id="0" w:name="_Toc223970579"/>
       <w:r>
         <w:lastRenderedPageBreak/>
+        <w:t>PAGINA PARA APRENDER HTML Y CSS.</w:t>
+      </w:r>
+    </w:p>
+    <w:p>
+      <w:hyperlink r:id="rId6" w:history="1">
+        <w:r>
+          <w:rPr>
+            <w:rStyle w:val="Hipervnculo"/>
+          </w:rPr>
+          <w:t>https://developer.mozilla.org/es/</w:t>
+        </w:r>
+      </w:hyperlink>
+      <w:r>
+        <w:t xml:space="preserve"> </w:t>
+      </w:r>
+    </w:p>
+    <w:p>
+      <w:pPr>
+        <w:pStyle w:val="Ttulo1"/>
+      </w:pPr>
+      <w:r>
         <w:t>CREACION DE FORMULARIO DE INICIO DE SESIÓN</w:t>
       </w:r>
       <w:bookmarkEnd w:id="0"/>
@@ -1182,7 +1203,7 @@
           <w:u w:val="none"/>
         </w:rPr>
       </w:pPr>
-      <w:hyperlink r:id="rId6" w:history="1">
+      <w:hyperlink r:id="rId7" w:history="1">
         <w:r>
           <w:rPr>
             <w:rStyle w:val="Hipervnculo"/>
@@ -1199,7 +1220,7 @@
           <w:numId w:val="3"/>
         </w:numPr>
       </w:pPr>
-      <w:hyperlink r:id="rId7" w:history="1">
+      <w:hyperlink r:id="rId8" w:history="1">
         <w:r>
           <w:rPr>
             <w:rStyle w:val="Hipervnculo"/>
@@ -1222,7 +1243,7 @@
       <w:bookmarkEnd w:id="1"/>
     </w:p>
     <w:p>
-      <w:hyperlink r:id="rId8" w:history="1">
+      <w:hyperlink r:id="rId9" w:history="1">
         <w:r>
           <w:rPr>
             <w:rStyle w:val="Hipervnculo"/>
@@ -1249,7 +1270,7 @@
       <w:r>
         <w:t xml:space="preserve"> </w:t>
       </w:r>
-      <w:hyperlink r:id="rId9" w:history="1">
+      <w:hyperlink r:id="rId10" w:history="1">
         <w:r>
           <w:rPr>
             <w:rStyle w:val="Hipervnculo"/>
@@ -1272,7 +1293,7 @@
       <w:bookmarkEnd w:id="3"/>
     </w:p>
     <w:p>
-      <w:hyperlink r:id="rId10" w:history="1">
+      <w:hyperlink r:id="rId11" w:history="1">
         <w:r>
           <w:rPr>
             <w:rStyle w:val="Hipervnculo"/>
@@ -1295,7 +1316,7 @@
       <w:bookmarkEnd w:id="4"/>
     </w:p>
     <w:p>
-      <w:hyperlink r:id="rId11" w:history="1">
+      <w:hyperlink r:id="rId12" w:history="1">
         <w:r>
           <w:rPr>
             <w:rStyle w:val="Hipervnculo"/>
@@ -1319,7 +1340,7 @@
       <w:r>
         <w:t xml:space="preserve"> </w:t>
       </w:r>
-      <w:hyperlink r:id="rId12" w:history="1">
+      <w:hyperlink r:id="rId13" w:history="1">
         <w:r>
           <w:rPr>
             <w:rStyle w:val="Hipervnculo"/>
@@ -1337,6 +1358,7 @@
       </w:pPr>
       <w:bookmarkStart w:id="6" w:name="_Toc223970585"/>
       <w:r>
+        <w:lastRenderedPageBreak/>
         <w:t>CREACION DE MENU PRINCIPAL</w:t>
       </w:r>
       <w:bookmarkEnd w:id="6"/>
@@ -1352,7 +1374,7 @@
           <w:numId w:val="1"/>
         </w:numPr>
       </w:pPr>
-      <w:hyperlink r:id="rId13" w:history="1">
+      <w:hyperlink r:id="rId14" w:history="1">
         <w:r>
           <w:rPr>
             <w:rStyle w:val="Hipervnculo"/>
@@ -1372,7 +1394,7 @@
           <w:numId w:val="1"/>
         </w:numPr>
       </w:pPr>
-      <w:hyperlink r:id="rId14" w:history="1">
+      <w:hyperlink r:id="rId15" w:history="1">
         <w:r>
           <w:rPr>
             <w:rStyle w:val="Hipervnculo"/>
@@ -1393,14 +1415,13 @@
         <w:rPr>
           <w:rStyle w:val="Ttulo1Car"/>
         </w:rPr>
-        <w:lastRenderedPageBreak/>
         <w:t>SEPARAR POR LINEAS LOS PARRAFOS</w:t>
       </w:r>
       <w:bookmarkEnd w:id="7"/>
       <w:r>
         <w:t xml:space="preserve"> </w:t>
       </w:r>
-      <w:hyperlink r:id="rId15" w:history="1">
+      <w:hyperlink r:id="rId16" w:history="1">
         <w:r>
           <w:rPr>
             <w:rStyle w:val="Hipervnculo"/>
@@ -1427,7 +1448,7 @@
       <w:r>
         <w:t xml:space="preserve"> </w:t>
       </w:r>
-      <w:hyperlink r:id="rId16" w:history="1">
+      <w:hyperlink r:id="rId17" w:history="1">
         <w:r>
           <w:rPr>
             <w:rStyle w:val="Hipervnculo"/>
@@ -1454,7 +1475,7 @@
       <w:r>
         <w:t xml:space="preserve"> </w:t>
       </w:r>
-      <w:hyperlink r:id="rId17" w:history="1">
+      <w:hyperlink r:id="rId18" w:history="1">
         <w:r>
           <w:rPr>
             <w:rStyle w:val="Hipervnculo"/>
@@ -1480,7 +1501,7 @@
       <w:pPr>
         <w:ind w:left="1440" w:firstLine="0"/>
       </w:pPr>
-      <w:hyperlink r:id="rId18" w:history="1">
+      <w:hyperlink r:id="rId19" w:history="1">
         <w:r>
           <w:rPr>
             <w:rStyle w:val="Hipervnculo"/>
@@ -1496,7 +1517,7 @@
       <w:pPr>
         <w:ind w:left="1440" w:firstLine="0"/>
       </w:pPr>
-      <w:hyperlink r:id="rId19" w:history="1">
+      <w:hyperlink r:id="rId20" w:history="1">
         <w:r>
           <w:rPr>
             <w:rStyle w:val="Hipervnculo"/>
@@ -1522,7 +1543,7 @@
       <w:pPr>
         <w:ind w:left="1440" w:firstLine="0"/>
       </w:pPr>
-      <w:hyperlink r:id="rId20" w:history="1">
+      <w:hyperlink r:id="rId21" w:history="1">
         <w:r>
           <w:rPr>
             <w:rStyle w:val="Hipervnculo"/>
@@ -1548,7 +1569,7 @@
       <w:pPr>
         <w:ind w:left="1440" w:firstLine="0"/>
       </w:pPr>
-      <w:hyperlink r:id="rId21" w:history="1">
+      <w:hyperlink r:id="rId22" w:history="1">
         <w:r>
           <w:rPr>
             <w:rStyle w:val="Hipervnculo"/>
@@ -1566,6 +1587,7 @@
       </w:pPr>
       <w:bookmarkStart w:id="13" w:name="_Toc223970592"/>
       <w:r>
+        <w:lastRenderedPageBreak/>
         <w:t>ANIMACION DE FORMULARIOS</w:t>
       </w:r>
       <w:bookmarkEnd w:id="13"/>
@@ -1574,7 +1596,7 @@
       <w:pPr>
         <w:ind w:left="1440" w:firstLine="0"/>
       </w:pPr>
-      <w:hyperlink r:id="rId22" w:history="1">
+      <w:hyperlink r:id="rId23" w:history="1">
         <w:r>
           <w:rPr>
             <w:rStyle w:val="Hipervnculo"/>
@@ -1592,7 +1614,6 @@
       </w:pPr>
       <w:bookmarkStart w:id="14" w:name="_Toc223970593"/>
       <w:r>
-        <w:lastRenderedPageBreak/>
         <w:t>TIPOS DE VALORES INPUT</w:t>
       </w:r>
       <w:bookmarkEnd w:id="14"/>
@@ -1601,7 +1622,7 @@
       <w:pPr>
         <w:ind w:left="1440" w:firstLine="0"/>
       </w:pPr>
-      <w:hyperlink r:id="rId23" w:history="1">
+      <w:hyperlink r:id="rId24" w:history="1">
         <w:r>
           <w:rPr>
             <w:rStyle w:val="Hipervnculo"/>
@@ -1627,24 +1648,12 @@
       <w:pPr>
         <w:ind w:left="1440" w:firstLine="0"/>
       </w:pPr>
-      <w:hyperlink r:id="rId24" w:history="1">
+      <w:hyperlink r:id="rId25" w:history="1">
         <w:r>
           <w:rPr>
             <w:rStyle w:val="Hipervnculo"/>
           </w:rPr>
-          <w:t>https://www.face</w:t>
-        </w:r>
-        <w:r>
-          <w:rPr>
-            <w:rStyle w:val="Hipervnculo"/>
-          </w:rPr>
-          <w:t>b</w:t>
-        </w:r>
-        <w:r>
-          <w:rPr>
-            <w:rStyle w:val="Hipervnculo"/>
-          </w:rPr>
-          <w:t>ook.com/reel/1712008609516777</w:t>
+          <w:t>https://www.facebook.com/reel/1712008609516777</w:t>
         </w:r>
       </w:hyperlink>
       <w:r>
@@ -1660,7 +1669,7 @@
       </w:r>
     </w:p>
     <w:p>
-      <w:hyperlink r:id="rId25" w:history="1">
+      <w:hyperlink r:id="rId26" w:history="1">
         <w:r>
           <w:rPr>
             <w:rStyle w:val="Hipervnculo"/>

</xml_diff>